<commit_message>
docs: focus Week 3 report exclusively on Multi-Currency and Email Monthly Reports
</commit_message>
<xml_diff>
--- a/Trackify_Weekly_Report_Week_2.docx
+++ b/Trackify_Weekly_Report_Week_2.docx
@@ -466,7 +466,7 @@
                 <w:rFonts w:ascii="Arial" w:hAnsi="Arial"/>
                 <w:sz w:val="19"/>
               </w:rPr>
-              <w:t>• Develop Social &amp; Group Expense Sharing module (Friends list, Direct peer messaging, Group bill creation).</w:t>
+              <w:t>• Implement Multi-Currency preference selection and dynamic formatting across ledgers.</w:t>
             </w:r>
           </w:p>
           <w:p>
@@ -479,7 +479,7 @@
                 <w:rFonts w:ascii="Arial" w:hAnsi="Arial"/>
                 <w:sz w:val="19"/>
               </w:rPr>
-              <w:t>• Build flexible Bill Splitting engine supporting Equal, Custom amount, and Percentage-based allocations.</w:t>
+              <w:t>• Build Automated Monthly Financial Reports dispatch via Email (Nodemailer).</w:t>
             </w:r>
           </w:p>
           <w:p>
@@ -492,7 +492,7 @@
                 <w:rFonts w:ascii="Arial" w:hAnsi="Arial"/>
                 <w:sz w:val="19"/>
               </w:rPr>
-              <w:t>• Develop Activity Heatmap grid, Spending Personality Quiz, Multi-Currency support, and Automated Email Monthly Reports.</w:t>
+              <w:t>• Reach Checkpoint 1 milestone tag on GitHub.</w:t>
             </w:r>
           </w:p>
         </w:tc>

</xml_diff>